<commit_message>
modified:   Documentation/verisure-homey-manuel-utilisateur-v1.8.0.docx modified:   app.json modified:   drivers/alarm-panel/device.js
</commit_message>
<xml_diff>
--- a/.homeybuild/Documentation/verisure-homey-manuel-utilisateur-v1.8.0.docx
+++ b/.homeybuild/Documentation/verisure-homey-manuel-utilisateur-v1.8.0.docx
@@ -4821,6 +4821,28 @@
     <w:p>
       <w:pPr>
         <w:spacing w:before="100" w:after="0"/>
+      </w:pPr>
+    </w:p>
+    <w:p>
+      <w:pPr>
+        <w:shd w:fill="FFF3E0" w:val="clear"/>
+        <w:spacing w:before="80" w:after="80"/>
+        <w:ind w:left="360"/>
+      </w:pPr>
+      <w:r>
+        <w:rPr>
+          <w:i/>
+          <w:iCs/>
+          <w:color w:val="C55A11"/>
+          <w:sz w:val="21"/>
+          <w:szCs w:val="21"/>
+        </w:rPr>
+        <w:t xml:space="preserve">⚠️  Bug connu — Application Homey Android (Samsung et autres) : au premier affichage du panel de la centrale, les 4 modes peuvent ne pas tous s'afficher immédiatement. Workaround : appuyer sur l'icône Flows (⇄) en bas du panel puis revenir — l'affichage est alors correct. Ce bug est lié au composant picker de l'app Homey Android et ne concerne pas iOS/iPadOS ni l'application web.</w:t>
+      </w:r>
+    </w:p>
+    <w:p>
+      <w:pPr>
+        <w:spacing w:before="60" w:after="0"/>
       </w:pPr>
     </w:p>
     <w:p>

</xml_diff>